<commit_message>
Revise MFT SDD: scope narrowed to the Boomi platform (Intelligrator & other programme projects removed). Add two platform pain points — no native CI/CD pipeline for MFT config (G-13) and no native enterprise password/secrets-manager path for MFT credentials (G-14). Diagram, Word, Excel, index.html updated; docs.zip rebuilt.
</commit_message>
<xml_diff>
--- a/assets/boomi-mft-solution-design-document.docx
+++ b/assets/boomi-mft-solution-design-document.docx
@@ -65,7 +65,7 @@
           <w:sz w:val="22"/>
           <w:szCs w:val="22"/>
         </w:rPr>
-        <w:t xml:space="preserve">Capabilities · Architecture · Integration with the HMRC estate · Features &amp; Gaps</w:t>
+        <w:t xml:space="preserve">Boomi platform capabilities · Architecture · Integration with the HMRC estate · Features, gaps &amp; drawbacks</w:t>
       </w:r>
     </w:p>
     <w:p>
@@ -989,7 +989,7 @@
                 <w:sz w:val="19"/>
                 <w:szCs w:val="19"/>
               </w:rPr>
-              <w:t xml:space="preserve">P-116</w:t>
+              <w:t xml:space="preserve">Estate</w:t>
             </w:r>
           </w:p>
         </w:tc>
@@ -1016,7 +1016,7 @@
                 <w:sz w:val="19"/>
                 <w:szCs w:val="19"/>
               </w:rPr>
-              <w:t xml:space="preserve">Integration Pattern Catalogue — Managed File Transfer (MFT) pattern</w:t>
+              <w:t xml:space="preserve">Legacy estate reference — WebMethods IS, ChRIS, ETMP, NPS, DES, HoD services</w:t>
             </w:r>
           </w:p>
         </w:tc>
@@ -1045,7 +1045,7 @@
                 <w:sz w:val="19"/>
                 <w:szCs w:val="19"/>
               </w:rPr>
-              <w:t xml:space="preserve">Intelligrator</w:t>
+              <w:t xml:space="preserve">Vendor</w:t>
             </w:r>
           </w:p>
         </w:tc>
@@ -1072,7 +1072,7 @@
                 <w:sz w:val="19"/>
                 <w:szCs w:val="19"/>
               </w:rPr>
-              <w:t xml:space="preserve">Intelligrator — self-service MFT/API onboarding product specification</w:t>
+              <w:t xml:space="preserve">Boomi native MFT (Thru) product documentation and release notes</w:t>
             </w:r>
           </w:p>
         </w:tc>
@@ -1101,7 +1101,7 @@
                 <w:sz w:val="19"/>
                 <w:szCs w:val="19"/>
               </w:rPr>
-              <w:t xml:space="preserve">Estate</w:t>
+              <w:t xml:space="preserve">Principle</w:t>
             </w:r>
           </w:p>
         </w:tc>
@@ -1128,63 +1128,7 @@
                 <w:sz w:val="19"/>
                 <w:szCs w:val="19"/>
               </w:rPr>
-              <w:t xml:space="preserve">Legacy estate reference — WebMethods IS, ChRIS, ETMP, NPS, DES, HoD services</w:t>
-            </w:r>
-          </w:p>
-        </w:tc>
-      </w:tr>
-      <w:tr>
-        <w:tc>
-          <w:tcPr>
-            <w:tcW w:type="dxa" w:w="2600"/>
-            <w:shd w:fill="F4F7FB" w:color="auto" w:val="clear"/>
-            <w:tcMar>
-              <w:top w:type="dxa" w:w="60"/>
-              <w:left w:type="dxa" w:w="90"/>
-              <w:bottom w:type="dxa" w:w="60"/>
-              <w:right w:type="dxa" w:w="90"/>
-            </w:tcMar>
-            <w:vAlign w:val="center"/>
-          </w:tcPr>
-          <w:p>
-            <w:pPr>
-              <w:spacing w:after="0" w:line="260"/>
-            </w:pPr>
-            <w:r>
-              <w:rPr>
-                <w:rFonts w:ascii="Calibri" w:cs="Calibri" w:eastAsia="Calibri" w:hAnsi="Calibri"/>
-                <w:color w:val="12161C"/>
-                <w:sz w:val="19"/>
-                <w:szCs w:val="19"/>
-              </w:rPr>
-              <w:t xml:space="preserve">Principle</w:t>
-            </w:r>
-          </w:p>
-        </w:tc>
-        <w:tc>
-          <w:tcPr>
-            <w:tcW w:type="dxa" w:w="6426"/>
-            <w:shd w:fill="F4F7FB" w:color="auto" w:val="clear"/>
-            <w:tcMar>
-              <w:top w:type="dxa" w:w="60"/>
-              <w:left w:type="dxa" w:w="90"/>
-              <w:bottom w:type="dxa" w:w="60"/>
-              <w:right w:type="dxa" w:w="90"/>
-            </w:tcMar>
-            <w:vAlign w:val="center"/>
-          </w:tcPr>
-          <w:p>
-            <w:pPr>
-              <w:spacing w:after="0" w:line="260"/>
-            </w:pPr>
-            <w:r>
-              <w:rPr>
-                <w:rFonts w:ascii="Calibri" w:cs="Calibri" w:eastAsia="Calibri" w:hAnsi="Calibri"/>
-                <w:color w:val="12161C"/>
-                <w:sz w:val="19"/>
-                <w:szCs w:val="19"/>
-              </w:rPr>
-              <w:t xml:space="preserve">“Config over construction” architecture principle (programme-wide)</w:t>
+              <w:t xml:space="preserve">“Config over construction” — recommended MFT platform design principle (this document)</w:t>
             </w:r>
           </w:p>
         </w:tc>
@@ -1513,7 +1457,7 @@
           <w:sz w:val="21"/>
           <w:szCs w:val="21"/>
         </w:rPr>
-        <w:t xml:space="preserve">The design is anchored to the programme's inviolable principle: </w:t>
+        <w:t xml:space="preserve">The design is anchored to a single recommended platform principle: </w:t>
       </w:r>
       <w:r>
         <w:rPr>
@@ -1533,7 +1477,7 @@
           <w:sz w:val="21"/>
           <w:szCs w:val="21"/>
         </w:rPr>
-        <w:t xml:space="preserve">. A single generic MFT engine process handles every transfer; each approved interface becomes a configuration row in a routing table, never a new Boomi component. This keeps the estate small, uniform, testable and cheap to govern as onboarding scales through the Intelligrator self-service portal.</w:t>
+        <w:t xml:space="preserve">. A single generic MFT engine process handles every transfer; each approved interface becomes a configuration row in a routing table, never a new Boomi component. This keeps the estate small, uniform, testable and cheap to govern as the number of onboarded transfers grows.</w:t>
       </w:r>
     </w:p>
     <w:tbl>
@@ -1604,7 +1548,7 @@
                 <w:sz w:val="19"/>
                 <w:szCs w:val="19"/>
               </w:rPr>
-              <w:t xml:space="preserve">Proceed on the basis that the design decisions (Section 12) are accepted and the seven open questions (Section 14) are assigned named owners before build — most materially: data residency/assurance for OFFICIAL, long-term audit retention beyond native defaults, and native protocol coverage vs partner requirements.</w:t>
+              <w:t xml:space="preserve">Proceed on the basis that the design decisions (Section 12) are accepted and the open questions (Section 14) are assigned named owners before build — most materially: data residency/assurance for OFFICIAL, long-term audit retention beyond native defaults, the absence of a native CI/CD pipeline for MFT configuration, and the lack of a native path to source MFT credentials from the enterprise password/secrets manager.</w:t>
             </w:r>
           </w:p>
         </w:tc>
@@ -1655,7 +1599,7 @@
           <w:sz w:val="21"/>
           <w:szCs w:val="21"/>
         </w:rPr>
-        <w:t xml:space="preserve">To provide the design baseline for MFT on Boomi sufficient for Design Authority sign-off: the capabilities relied upon, the target architecture, how it integrates with the HMRC estate, the non-functional posture, and an honest assessment of gaps and the decisions/actions they drive.</w:t>
+        <w:t xml:space="preserve">To provide the design baseline for MFT on the Boomi platform sufficient for Design Authority sign-off: the platform capabilities relied upon, the target architecture, how it integrates with the HMRC estate, the non-functional posture, and an honest assessment of platform gaps and drawbacks and the decisions/actions they drive.</w:t>
       </w:r>
     </w:p>
     <w:p>
@@ -1803,7 +1747,7 @@
           <w:sz w:val="21"/>
           <w:szCs w:val="21"/>
         </w:rPr>
-        <w:t xml:space="preserve">Per-interface onboarding detail (handled as configuration via Intelligrator, not design).</w:t>
+        <w:t xml:space="preserve">Per-interface onboarding detail (each transfer is delivered as configuration, not design).</w:t>
       </w:r>
     </w:p>
     <w:p>
@@ -1822,7 +1766,7 @@
           <w:sz w:val="21"/>
           <w:szCs w:val="21"/>
         </w:rPr>
-        <w:t xml:space="preserve">API Management and event-streaming patterns (covered by their own designs).</w:t>
+        <w:t xml:space="preserve">API Management and event-streaming capabilities (separate Boomi platform designs).</w:t>
       </w:r>
     </w:p>
     <w:p>
@@ -1891,7 +1835,7 @@
           <w:sz w:val="21"/>
           <w:szCs w:val="21"/>
         </w:rPr>
-        <w:t xml:space="preserve">Design Authority, Security Architecture, Integration Architecture, Platform Operations, and the Intelligrator product team.</w:t>
+        <w:t xml:space="preserve">Design Authority, Security Architecture, Integration Architecture, and Platform Operations.</w:t>
       </w:r>
     </w:p>
     <w:p>
@@ -2020,7 +1964,7 @@
           <w:sz w:val="21"/>
           <w:szCs w:val="21"/>
         </w:rPr>
-        <w:t xml:space="preserve">Enable governed self-service onboarding via Intelligrator.</w:t>
+        <w:t xml:space="preserve">Standardise onboarding so each new transfer is a governed configuration change, not a build.</w:t>
       </w:r>
     </w:p>
     <w:p>
@@ -5369,7 +5313,7 @@
           <w:sz w:val="25"/>
           <w:szCs w:val="25"/>
         </w:rPr>
-        <w:t xml:space="preserve">8.3  Intelligrator (self-service onboarding)</w:t>
+        <w:t xml:space="preserve">8.3  Onboarding model (configuration, not build)</w:t>
       </w:r>
     </w:p>
     <w:p>
@@ -5383,7 +5327,7 @@
           <w:sz w:val="21"/>
           <w:szCs w:val="21"/>
         </w:rPr>
-        <w:t xml:space="preserve">Intelligrator is the governed front door: an approved interface request results in a new configuration row written to the routing table consumed by the generic engine. Intelligrator enforces the approval gate and standards; it does not create Boomi components, preserving config-over-construction end to end.</w:t>
+        <w:t xml:space="preserve">A new transfer is onboarded by adding a configuration row to the routing table consumed by the generic engine, following a governed change with an approval gate and standards check (endpoints, protocol, key references, schedule, filename pattern, post-actions, ownership). No new Boomi component is created, preserving config-over-construction end to end. Onboarding is performed through Boomi's native MFT administration; a bespoke self-service onboarding portal is out of scope for this platform design.</w:t>
       </w:r>
     </w:p>
     <w:p>
@@ -5419,7 +5363,7 @@
           <w:sz w:val="21"/>
           <w:szCs w:val="21"/>
         </w:rPr>
-        <w:t xml:space="preserve">Operator/administrator access to the platform is via the enterprise IdP/SSO (a later programme phase); partner authentication is by SSH key / certificate.</w:t>
+        <w:t xml:space="preserve">Operator/administrator access to the platform is via the enterprise IdP/SSO (to confirm); partner authentication is by SSH key / certificate.</w:t>
       </w:r>
     </w:p>
     <w:p>
@@ -6625,6 +6569,176 @@
           </w:p>
         </w:tc>
       </w:tr>
+      <w:tr>
+        <w:tc>
+          <w:tcPr>
+            <w:tcW w:type="dxa" w:w="2500"/>
+            <w:shd w:fill="FFFFFF" w:color="auto" w:val="clear"/>
+            <w:tcMar>
+              <w:top w:type="dxa" w:w="60"/>
+              <w:left w:type="dxa" w:w="90"/>
+              <w:bottom w:type="dxa" w:w="60"/>
+              <w:right w:type="dxa" w:w="90"/>
+            </w:tcMar>
+            <w:vAlign w:val="center"/>
+          </w:tcPr>
+          <w:p>
+            <w:pPr>
+              <w:spacing w:after="0" w:line="260"/>
+            </w:pPr>
+            <w:r>
+              <w:rPr>
+                <w:rFonts w:ascii="Calibri" w:cs="Calibri" w:eastAsia="Calibri" w:hAnsi="Calibri"/>
+                <w:color w:val="12161C"/>
+                <w:sz w:val="19"/>
+                <w:szCs w:val="19"/>
+              </w:rPr>
+              <w:t xml:space="preserve">CI/CD pipeline for MFT config</w:t>
+            </w:r>
+          </w:p>
+        </w:tc>
+        <w:tc>
+          <w:tcPr>
+            <w:tcW w:type="dxa" w:w="4826"/>
+            <w:shd w:fill="FFFFFF" w:color="auto" w:val="clear"/>
+            <w:tcMar>
+              <w:top w:type="dxa" w:w="60"/>
+              <w:left w:type="dxa" w:w="90"/>
+              <w:bottom w:type="dxa" w:w="60"/>
+              <w:right w:type="dxa" w:w="90"/>
+            </w:tcMar>
+            <w:vAlign w:val="center"/>
+          </w:tcPr>
+          <w:p>
+            <w:pPr>
+              <w:spacing w:after="0" w:line="260"/>
+            </w:pPr>
+            <w:r>
+              <w:rPr>
+                <w:rFonts w:ascii="Calibri" w:cs="Calibri" w:eastAsia="Calibri" w:hAnsi="Calibri"/>
+                <w:color w:val="12161C"/>
+                <w:sz w:val="19"/>
+                <w:szCs w:val="19"/>
+              </w:rPr>
+              <w:t xml:space="preserve">Promote transfer config dev→test→prod</w:t>
+            </w:r>
+          </w:p>
+        </w:tc>
+        <w:tc>
+          <w:tcPr>
+            <w:tcW w:type="dxa" w:w="1700"/>
+            <w:shd w:fill="FFFFFF" w:color="auto" w:val="clear"/>
+            <w:tcMar>
+              <w:top w:type="dxa" w:w="60"/>
+              <w:left w:type="dxa" w:w="90"/>
+              <w:bottom w:type="dxa" w:w="60"/>
+              <w:right w:type="dxa" w:w="90"/>
+            </w:tcMar>
+            <w:vAlign w:val="center"/>
+          </w:tcPr>
+          <w:p>
+            <w:pPr>
+              <w:spacing w:after="0" w:line="260"/>
+            </w:pPr>
+            <w:r>
+              <w:rPr>
+                <w:rFonts w:ascii="Calibri" w:cs="Calibri" w:eastAsia="Calibri" w:hAnsi="Calibri"/>
+                <w:b/>
+                <w:bCs/>
+                <w:color w:val="B3261E"/>
+                <w:sz w:val="19"/>
+                <w:szCs w:val="19"/>
+              </w:rPr>
+              <w:t xml:space="preserve">○ gap</w:t>
+            </w:r>
+          </w:p>
+        </w:tc>
+      </w:tr>
+      <w:tr>
+        <w:tc>
+          <w:tcPr>
+            <w:tcW w:type="dxa" w:w="2500"/>
+            <w:shd w:fill="F4F7FB" w:color="auto" w:val="clear"/>
+            <w:tcMar>
+              <w:top w:type="dxa" w:w="60"/>
+              <w:left w:type="dxa" w:w="90"/>
+              <w:bottom w:type="dxa" w:w="60"/>
+              <w:right w:type="dxa" w:w="90"/>
+            </w:tcMar>
+            <w:vAlign w:val="center"/>
+          </w:tcPr>
+          <w:p>
+            <w:pPr>
+              <w:spacing w:after="0" w:line="260"/>
+            </w:pPr>
+            <w:r>
+              <w:rPr>
+                <w:rFonts w:ascii="Calibri" w:cs="Calibri" w:eastAsia="Calibri" w:hAnsi="Calibri"/>
+                <w:color w:val="12161C"/>
+                <w:sz w:val="19"/>
+                <w:szCs w:val="19"/>
+              </w:rPr>
+              <w:t xml:space="preserve">Enterprise secrets / password manager</w:t>
+            </w:r>
+          </w:p>
+        </w:tc>
+        <w:tc>
+          <w:tcPr>
+            <w:tcW w:type="dxa" w:w="4826"/>
+            <w:shd w:fill="F4F7FB" w:color="auto" w:val="clear"/>
+            <w:tcMar>
+              <w:top w:type="dxa" w:w="60"/>
+              <w:left w:type="dxa" w:w="90"/>
+              <w:bottom w:type="dxa" w:w="60"/>
+              <w:right w:type="dxa" w:w="90"/>
+            </w:tcMar>
+            <w:vAlign w:val="center"/>
+          </w:tcPr>
+          <w:p>
+            <w:pPr>
+              <w:spacing w:after="0" w:line="260"/>
+            </w:pPr>
+            <w:r>
+              <w:rPr>
+                <w:rFonts w:ascii="Calibri" w:cs="Calibri" w:eastAsia="Calibri" w:hAnsi="Calibri"/>
+                <w:color w:val="12161C"/>
+                <w:sz w:val="19"/>
+                <w:szCs w:val="19"/>
+              </w:rPr>
+              <w:t xml:space="preserve">Source MFT/partner credentials externally</w:t>
+            </w:r>
+          </w:p>
+        </w:tc>
+        <w:tc>
+          <w:tcPr>
+            <w:tcW w:type="dxa" w:w="1700"/>
+            <w:shd w:fill="F4F7FB" w:color="auto" w:val="clear"/>
+            <w:tcMar>
+              <w:top w:type="dxa" w:w="60"/>
+              <w:left w:type="dxa" w:w="90"/>
+              <w:bottom w:type="dxa" w:w="60"/>
+              <w:right w:type="dxa" w:w="90"/>
+            </w:tcMar>
+            <w:vAlign w:val="center"/>
+          </w:tcPr>
+          <w:p>
+            <w:pPr>
+              <w:spacing w:after="0" w:line="260"/>
+            </w:pPr>
+            <w:r>
+              <w:rPr>
+                <w:rFonts w:ascii="Calibri" w:cs="Calibri" w:eastAsia="Calibri" w:hAnsi="Calibri"/>
+                <w:b/>
+                <w:bCs/>
+                <w:color w:val="B3261E"/>
+                <w:sz w:val="19"/>
+                <w:szCs w:val="19"/>
+              </w:rPr>
+              <w:t xml:space="preserve">○ gap</w:t>
+            </w:r>
+          </w:p>
+        </w:tc>
+      </w:tr>
     </w:tbl>
     <w:p>
       <w:r>
@@ -6932,6 +7046,80 @@
         <w:t xml:space="preserve">This section is deliberately candid. Each gap is stated with its impact and a mitigation/action, so the Design Authority can accept, mitigate or challenge it rather than discover it in build.</w:t>
       </w:r>
     </w:p>
+    <w:tbl>
+      <w:tblPr>
+        <w:tblW w:type="dxa" w:w="9026"/>
+        <w:tblBorders>
+          <w:top w:val="none"/>
+          <w:left w:val="single" w:color="B3261E" w:sz="18"/>
+          <w:bottom w:val="none"/>
+          <w:right w:val="none"/>
+          <w:insideH w:val="none"/>
+          <w:insideV w:val="none"/>
+        </w:tblBorders>
+      </w:tblPr>
+      <w:tblGrid>
+        <w:gridCol w:w="9026"/>
+      </w:tblGrid>
+      <w:tr>
+        <w:tc>
+          <w:tcPr>
+            <w:tcW w:type="dxa" w:w="9026"/>
+            <w:shd w:fill="FDECEA" w:color="auto" w:val="clear"/>
+            <w:tcMar>
+              <w:top w:type="dxa" w:w="100"/>
+              <w:left w:type="dxa" w:w="160"/>
+              <w:bottom w:type="dxa" w:w="100"/>
+              <w:right w:type="dxa" w:w="140"/>
+            </w:tcMar>
+          </w:tcPr>
+          <w:p>
+            <w:pPr>
+              <w:spacing w:after="40"/>
+            </w:pPr>
+            <w:r>
+              <w:rPr>
+                <w:rFonts w:ascii="Calibri" w:cs="Calibri" w:eastAsia="Calibri" w:hAnsi="Calibri"/>
+                <w:b/>
+                <w:bCs/>
+                <w:color w:val="B3261E"/>
+                <w:sz w:val="20"/>
+                <w:szCs w:val="20"/>
+              </w:rPr>
+              <w:t xml:space="preserve">Headline platform drawbacks (pain points)</w:t>
+            </w:r>
+          </w:p>
+          <w:p>
+            <w:pPr>
+              <w:spacing w:after="20" w:line="264"/>
+            </w:pPr>
+            <w:r>
+              <w:rPr>
+                <w:rFonts w:ascii="Calibri" w:cs="Calibri" w:eastAsia="Calibri" w:hAnsi="Calibri"/>
+                <w:color w:val="12161C"/>
+                <w:sz w:val="19"/>
+                <w:szCs w:val="19"/>
+              </w:rPr>
+              <w:t xml:space="preserve">No native CI/CD pipeline for MFT (G-13): the platform has no built-in, MFT-config-aware pipeline. Promotion of transfer configuration dev→test→prod is UI/admin-driven, and environment-promotion is not fully automatable through the API, so a repeatable pipeline must be built externally over the AtomSphere APIs and enterprise DevOps tooling.</w:t>
+            </w:r>
+          </w:p>
+          <w:p>
+            <w:pPr>
+              <w:spacing w:after="20" w:line="264"/>
+            </w:pPr>
+            <w:r>
+              <w:rPr>
+                <w:rFonts w:ascii="Calibri" w:cs="Calibri" w:eastAsia="Calibri" w:hAnsi="Calibri"/>
+                <w:color w:val="12161C"/>
+                <w:sz w:val="19"/>
+                <w:szCs w:val="19"/>
+              </w:rPr>
+              <w:t xml:space="preserve">No native enterprise password/secrets-manager integration for MFT credentials (G-14): Boomi's Secrets Management Service is oriented to the Integration runtime and cloud vaults (e.g. Azure Key Vault); there is no documented native path to source MFT endpoint/trading-partner credentials (SFTP keys, partner passwords) from an enterprise password manager such as CyberArk PAM — they are held in the MFT store, which weakens central rotation and privileged-access governance.</w:t>
+            </w:r>
+          </w:p>
+        </w:tc>
+      </w:tr>
+    </w:tbl>
     <w:tbl>
       <w:tblPr>
         <w:tblW w:type="dxa" w:w="9026"/>
@@ -8391,6 +8579,226 @@
           </w:p>
         </w:tc>
       </w:tr>
+      <w:tr>
+        <w:tc>
+          <w:tcPr>
+            <w:tcW w:type="dxa" w:w="1100"/>
+            <w:shd w:fill="FFFFFF" w:color="auto" w:val="clear"/>
+            <w:tcMar>
+              <w:top w:type="dxa" w:w="60"/>
+              <w:left w:type="dxa" w:w="90"/>
+              <w:bottom w:type="dxa" w:w="60"/>
+              <w:right w:type="dxa" w:w="90"/>
+            </w:tcMar>
+            <w:vAlign w:val="center"/>
+          </w:tcPr>
+          <w:p>
+            <w:pPr>
+              <w:spacing w:after="0" w:line="260"/>
+            </w:pPr>
+            <w:r>
+              <w:rPr>
+                <w:rFonts w:ascii="Calibri" w:cs="Calibri" w:eastAsia="Calibri" w:hAnsi="Calibri"/>
+                <w:color w:val="12161C"/>
+                <w:sz w:val="19"/>
+                <w:szCs w:val="19"/>
+              </w:rPr>
+              <w:t xml:space="preserve">G-13</w:t>
+            </w:r>
+          </w:p>
+        </w:tc>
+        <w:tc>
+          <w:tcPr>
+            <w:tcW w:type="dxa" w:w="3100"/>
+            <w:shd w:fill="FFFFFF" w:color="auto" w:val="clear"/>
+            <w:tcMar>
+              <w:top w:type="dxa" w:w="60"/>
+              <w:left w:type="dxa" w:w="90"/>
+              <w:bottom w:type="dxa" w:w="60"/>
+              <w:right w:type="dxa" w:w="90"/>
+            </w:tcMar>
+            <w:vAlign w:val="center"/>
+          </w:tcPr>
+          <w:p>
+            <w:pPr>
+              <w:spacing w:after="0" w:line="260"/>
+            </w:pPr>
+            <w:r>
+              <w:rPr>
+                <w:rFonts w:ascii="Calibri" w:cs="Calibri" w:eastAsia="Calibri" w:hAnsi="Calibri"/>
+                <w:color w:val="12161C"/>
+                <w:sz w:val="19"/>
+                <w:szCs w:val="19"/>
+              </w:rPr>
+              <w:t xml:space="preserve">No native CI/CD pipeline for MFT configuration; promotion dev→test→prod is UI/admin-driven and environment-promotion is not fully API-automatable.</w:t>
+            </w:r>
+          </w:p>
+        </w:tc>
+        <w:tc>
+          <w:tcPr>
+            <w:tcW w:type="dxa" w:w="2400"/>
+            <w:shd w:fill="FFFFFF" w:color="auto" w:val="clear"/>
+            <w:tcMar>
+              <w:top w:type="dxa" w:w="60"/>
+              <w:left w:type="dxa" w:w="90"/>
+              <w:bottom w:type="dxa" w:w="60"/>
+              <w:right w:type="dxa" w:w="90"/>
+            </w:tcMar>
+            <w:vAlign w:val="center"/>
+          </w:tcPr>
+          <w:p>
+            <w:pPr>
+              <w:spacing w:after="0" w:line="260"/>
+            </w:pPr>
+            <w:r>
+              <w:rPr>
+                <w:rFonts w:ascii="Calibri" w:cs="Calibri" w:eastAsia="Calibri" w:hAnsi="Calibri"/>
+                <w:color w:val="12161C"/>
+                <w:sz w:val="19"/>
+                <w:szCs w:val="19"/>
+              </w:rPr>
+              <w:t xml:space="preserve">Manual promotion; weak traceability, review and rollback.</w:t>
+            </w:r>
+          </w:p>
+        </w:tc>
+        <w:tc>
+          <w:tcPr>
+            <w:tcW w:type="dxa" w:w="2426"/>
+            <w:shd w:fill="FFFFFF" w:color="auto" w:val="clear"/>
+            <w:tcMar>
+              <w:top w:type="dxa" w:w="60"/>
+              <w:left w:type="dxa" w:w="90"/>
+              <w:bottom w:type="dxa" w:w="60"/>
+              <w:right w:type="dxa" w:w="90"/>
+            </w:tcMar>
+            <w:vAlign w:val="center"/>
+          </w:tcPr>
+          <w:p>
+            <w:pPr>
+              <w:spacing w:after="0" w:line="260"/>
+            </w:pPr>
+            <w:r>
+              <w:rPr>
+                <w:rFonts w:ascii="Calibri" w:cs="Calibri" w:eastAsia="Calibri" w:hAnsi="Calibri"/>
+                <w:color w:val="12161C"/>
+                <w:sz w:val="19"/>
+                <w:szCs w:val="19"/>
+              </w:rPr>
+              <w:t xml:space="preserve">Build external CI/CD over AtomSphere APIs + DevOps tooling; hold the config/routing table in Git; gated, audited promotion.</w:t>
+            </w:r>
+          </w:p>
+        </w:tc>
+      </w:tr>
+      <w:tr>
+        <w:tc>
+          <w:tcPr>
+            <w:tcW w:type="dxa" w:w="1100"/>
+            <w:shd w:fill="F4F7FB" w:color="auto" w:val="clear"/>
+            <w:tcMar>
+              <w:top w:type="dxa" w:w="60"/>
+              <w:left w:type="dxa" w:w="90"/>
+              <w:bottom w:type="dxa" w:w="60"/>
+              <w:right w:type="dxa" w:w="90"/>
+            </w:tcMar>
+            <w:vAlign w:val="center"/>
+          </w:tcPr>
+          <w:p>
+            <w:pPr>
+              <w:spacing w:after="0" w:line="260"/>
+            </w:pPr>
+            <w:r>
+              <w:rPr>
+                <w:rFonts w:ascii="Calibri" w:cs="Calibri" w:eastAsia="Calibri" w:hAnsi="Calibri"/>
+                <w:color w:val="12161C"/>
+                <w:sz w:val="19"/>
+                <w:szCs w:val="19"/>
+              </w:rPr>
+              <w:t xml:space="preserve">G-14</w:t>
+            </w:r>
+          </w:p>
+        </w:tc>
+        <w:tc>
+          <w:tcPr>
+            <w:tcW w:type="dxa" w:w="3100"/>
+            <w:shd w:fill="F4F7FB" w:color="auto" w:val="clear"/>
+            <w:tcMar>
+              <w:top w:type="dxa" w:w="60"/>
+              <w:left w:type="dxa" w:w="90"/>
+              <w:bottom w:type="dxa" w:w="60"/>
+              <w:right w:type="dxa" w:w="90"/>
+            </w:tcMar>
+            <w:vAlign w:val="center"/>
+          </w:tcPr>
+          <w:p>
+            <w:pPr>
+              <w:spacing w:after="0" w:line="260"/>
+            </w:pPr>
+            <w:r>
+              <w:rPr>
+                <w:rFonts w:ascii="Calibri" w:cs="Calibri" w:eastAsia="Calibri" w:hAnsi="Calibri"/>
+                <w:color w:val="12161C"/>
+                <w:sz w:val="19"/>
+                <w:szCs w:val="19"/>
+              </w:rPr>
+              <w:t xml:space="preserve">No documented native path to source MFT endpoint/trading-partner credentials from the enterprise password/secrets manager (e.g. CyberArk PAM). Boomi's Secrets Management Service targets the Integration runtime and cloud vaults (e.g. Azure Key Vault), not MFT partner credentials.</w:t>
+            </w:r>
+          </w:p>
+        </w:tc>
+        <w:tc>
+          <w:tcPr>
+            <w:tcW w:type="dxa" w:w="2400"/>
+            <w:shd w:fill="F4F7FB" w:color="auto" w:val="clear"/>
+            <w:tcMar>
+              <w:top w:type="dxa" w:w="60"/>
+              <w:left w:type="dxa" w:w="90"/>
+              <w:bottom w:type="dxa" w:w="60"/>
+              <w:right w:type="dxa" w:w="90"/>
+            </w:tcMar>
+            <w:vAlign w:val="center"/>
+          </w:tcPr>
+          <w:p>
+            <w:pPr>
+              <w:spacing w:after="0" w:line="260"/>
+            </w:pPr>
+            <w:r>
+              <w:rPr>
+                <w:rFonts w:ascii="Calibri" w:cs="Calibri" w:eastAsia="Calibri" w:hAnsi="Calibri"/>
+                <w:color w:val="12161C"/>
+                <w:sz w:val="19"/>
+                <w:szCs w:val="19"/>
+              </w:rPr>
+              <w:t xml:space="preserve">Credentials held in the MFT store; weaker central rotation and PAM governance.</w:t>
+            </w:r>
+          </w:p>
+        </w:tc>
+        <w:tc>
+          <w:tcPr>
+            <w:tcW w:type="dxa" w:w="2426"/>
+            <w:shd w:fill="F4F7FB" w:color="auto" w:val="clear"/>
+            <w:tcMar>
+              <w:top w:type="dxa" w:w="60"/>
+              <w:left w:type="dxa" w:w="90"/>
+              <w:bottom w:type="dxa" w:w="60"/>
+              <w:right w:type="dxa" w:w="90"/>
+            </w:tcMar>
+            <w:vAlign w:val="center"/>
+          </w:tcPr>
+          <w:p>
+            <w:pPr>
+              <w:spacing w:after="0" w:line="260"/>
+            </w:pPr>
+            <w:r>
+              <w:rPr>
+                <w:rFonts w:ascii="Calibri" w:cs="Calibri" w:eastAsia="Calibri" w:hAnsi="Calibri"/>
+                <w:color w:val="12161C"/>
+                <w:sz w:val="19"/>
+                <w:szCs w:val="19"/>
+              </w:rPr>
+              <w:t xml:space="preserve">Validate MFT credential sourcing with vendor; where unsupported, broker via Integration + secrets service or controlled vault sync; agree approach with Security.</w:t>
+            </w:r>
+          </w:p>
+        </w:tc>
+      </w:tr>
     </w:tbl>
     <w:p>
       <w:r>
@@ -8767,7 +9175,7 @@
                 <w:sz w:val="19"/>
                 <w:szCs w:val="19"/>
               </w:rPr>
-              <w:t xml:space="preserve">Consumed by engine and written by Intelligrator; auditable.</w:t>
+              <w:t xml:space="preserve">Consumed by engine, written through the governed onboarding change; auditable and Git-versionable.</w:t>
             </w:r>
           </w:p>
         </w:tc>
@@ -9358,7 +9766,7 @@
           <w:sz w:val="21"/>
           <w:szCs w:val="21"/>
         </w:rPr>
-        <w:t xml:space="preserve">Enterprise IdP/SSO for operator access (later phase).</w:t>
+        <w:t xml:space="preserve">Enterprise IdP/SSO for operator access (to confirm).</w:t>
       </w:r>
     </w:p>
     <w:p>
@@ -9396,7 +9804,26 @@
           <w:sz w:val="21"/>
           <w:szCs w:val="21"/>
         </w:rPr>
-        <w:t xml:space="preserve">Intelligrator for governed config authoring.</w:t>
+        <w:t xml:space="preserve">Enterprise password/secrets manager (e.g. CyberArk) — MFT credential sourcing to validate (G-14).</w:t>
+      </w:r>
+    </w:p>
+    <w:p>
+      <w:pPr>
+        <w:pStyle w:val="ListParagraph"/>
+        <w:numPr>
+          <w:ilvl w:val="0"/>
+          <w:numId w:val="1"/>
+        </w:numPr>
+        <w:spacing w:after="60" w:line="268"/>
+      </w:pPr>
+      <w:r>
+        <w:rPr>
+          <w:rFonts w:ascii="Calibri" w:cs="Calibri" w:eastAsia="Calibri" w:hAnsi="Calibri"/>
+          <w:color w:val="12161C"/>
+          <w:sz w:val="21"/>
+          <w:szCs w:val="21"/>
+        </w:rPr>
+        <w:t xml:space="preserve">External DevOps/CI-CD tooling and AtomSphere API entitlements for config promotion (G-13).</w:t>
       </w:r>
     </w:p>
     <w:p>
@@ -10088,7 +10515,7 @@
                 <w:sz w:val="19"/>
                 <w:szCs w:val="19"/>
               </w:rPr>
-              <w:t xml:space="preserve">Does the Intelligrator wizard Submit require both connection tests to pass before enabling?</w:t>
+              <w:t xml:space="preserve">How will MFT configuration be promoted dev→test→prod without a native pipeline — what CI/CD approach (AtomSphere API + DevOps) and who owns it?</w:t>
             </w:r>
           </w:p>
         </w:tc>
@@ -10096,6 +10523,89 @@
           <w:tcPr>
             <w:tcW w:type="dxa" w:w="1726"/>
             <w:shd w:fill="FFFFFF" w:color="auto" w:val="clear"/>
+            <w:tcMar>
+              <w:top w:type="dxa" w:w="60"/>
+              <w:left w:type="dxa" w:w="90"/>
+              <w:bottom w:type="dxa" w:w="60"/>
+              <w:right w:type="dxa" w:w="90"/>
+            </w:tcMar>
+            <w:vAlign w:val="center"/>
+          </w:tcPr>
+          <w:p>
+            <w:pPr>
+              <w:spacing w:after="0" w:line="260"/>
+            </w:pPr>
+            <w:r>
+              <w:rPr>
+                <w:rFonts w:ascii="Calibri" w:cs="Calibri" w:eastAsia="Calibri" w:hAnsi="Calibri"/>
+                <w:color w:val="12161C"/>
+                <w:sz w:val="19"/>
+                <w:szCs w:val="19"/>
+              </w:rPr>
+              <w:t xml:space="preserve">TBC</w:t>
+            </w:r>
+          </w:p>
+        </w:tc>
+      </w:tr>
+      <w:tr>
+        <w:tc>
+          <w:tcPr>
+            <w:tcW w:type="dxa" w:w="900"/>
+            <w:shd w:fill="F4F7FB" w:color="auto" w:val="clear"/>
+            <w:tcMar>
+              <w:top w:type="dxa" w:w="60"/>
+              <w:left w:type="dxa" w:w="90"/>
+              <w:bottom w:type="dxa" w:w="60"/>
+              <w:right w:type="dxa" w:w="90"/>
+            </w:tcMar>
+            <w:vAlign w:val="center"/>
+          </w:tcPr>
+          <w:p>
+            <w:pPr>
+              <w:spacing w:after="0" w:line="260"/>
+            </w:pPr>
+            <w:r>
+              <w:rPr>
+                <w:rFonts w:ascii="Calibri" w:cs="Calibri" w:eastAsia="Calibri" w:hAnsi="Calibri"/>
+                <w:color w:val="12161C"/>
+                <w:sz w:val="19"/>
+                <w:szCs w:val="19"/>
+              </w:rPr>
+              <w:t xml:space="preserve">8</w:t>
+            </w:r>
+          </w:p>
+        </w:tc>
+        <w:tc>
+          <w:tcPr>
+            <w:tcW w:type="dxa" w:w="6400"/>
+            <w:shd w:fill="F4F7FB" w:color="auto" w:val="clear"/>
+            <w:tcMar>
+              <w:top w:type="dxa" w:w="60"/>
+              <w:left w:type="dxa" w:w="90"/>
+              <w:bottom w:type="dxa" w:w="60"/>
+              <w:right w:type="dxa" w:w="90"/>
+            </w:tcMar>
+            <w:vAlign w:val="center"/>
+          </w:tcPr>
+          <w:p>
+            <w:pPr>
+              <w:spacing w:after="0" w:line="260"/>
+            </w:pPr>
+            <w:r>
+              <w:rPr>
+                <w:rFonts w:ascii="Calibri" w:cs="Calibri" w:eastAsia="Calibri" w:hAnsi="Calibri"/>
+                <w:color w:val="12161C"/>
+                <w:sz w:val="19"/>
+                <w:szCs w:val="19"/>
+              </w:rPr>
+              <w:t xml:space="preserve">Can MFT endpoint/partner credentials be sourced from the enterprise password/secrets manager (e.g. CyberArk), or must they live in the MFT store — and is that acceptable to Security?</w:t>
+            </w:r>
+          </w:p>
+        </w:tc>
+        <w:tc>
+          <w:tcPr>
+            <w:tcW w:type="dxa" w:w="1726"/>
+            <w:shd w:fill="F4F7FB" w:color="auto" w:val="clear"/>
             <w:tcMar>
               <w:top w:type="dxa" w:w="60"/>
               <w:left w:type="dxa" w:w="90"/>

</xml_diff>

<commit_message>
Redraw architecture to match the estate logical view: External estate (OGDs/MDTP/SaaS S4H,CF-MSD,Pega,CDS) -> Boomi iPaaS Platform -> trust boundary -> Boomi Internal Runtime -> HoD apps on AWS/Azure/Crown Hosting/Fujitsu. draw.io keeps HMRC zone labels; SVG/PNG neutralised for the HMRC-free page. Word/Excel/HTML narratives realigned to the real systems; two platform gaps retained.
</commit_message>
<xml_diff>
--- a/assets/boomi-mft-solution-design-document.docx
+++ b/assets/boomi-mft-solution-design-document.docx
@@ -1016,7 +1016,7 @@
                 <w:sz w:val="19"/>
                 <w:szCs w:val="19"/>
               </w:rPr>
-              <w:t xml:space="preserve">Legacy estate reference — WebMethods IS, ChRIS, ETMP, NPS, DES, HoD services</w:t>
+              <w:t xml:space="preserve">Estate reference — MDTP, SaaS systems (S4H, CF/MSD, Pega, CDS), HoD applications (AWS/Azure/Crown Hosting/Fujitsu); WebMethods (coexistence)</w:t>
             </w:r>
           </w:p>
         </w:tc>
@@ -1673,7 +1673,7 @@
           <w:sz w:val="21"/>
           <w:szCs w:val="21"/>
         </w:rPr>
-        <w:t xml:space="preserve">Integration with estate systems (ETMP, NPS, DES, ChRIS, HoD) and WebMethods coexistence.</w:t>
+        <w:t xml:space="preserve">Integration with MDTP, the SaaS systems (S4H, CF/MSD, Pega, CDS) and the HoD applications hosted across AWS, Azure, Crown Hosting and Fujitsu; WebMethods coexistence.</w:t>
       </w:r>
     </w:p>
     <w:p>
@@ -1871,7 +1871,7 @@
           <w:sz w:val="21"/>
           <w:szCs w:val="21"/>
         </w:rPr>
-        <w:t xml:space="preserve">HMRC's integration estate has historically moved files through a mix of WebMethods Integration Server flows, ChRIS, and bespoke scheduled SFTP scripts, point-to-point between systems of record such as ETMP, NPS and DES, and outward to other government departments, agents and financial institutions. This fragmentation produces inconsistent security controls, weak central audit, and a per-interface bespoke build cost that does not scale.</w:t>
+        <w:t xml:space="preserve">The estate moves files between external consumers/OGDs, the digital tax platform (MDTP) and the SaaS systems (S4H, CF/MSD, Pega, CDS), and the Heads-of-Duty (HoD) applications hosted across AWS, Azure, Crown Hosting and Fujitsu — historically through a mix of WebMethods Integration Server flows and bespoke scheduled SFTP scripts. This fragmentation produces inconsistent security controls, weak central audit, and a per-interface bespoke build cost that does not scale.</w:t>
       </w:r>
     </w:p>
     <w:p>
@@ -2048,7 +2048,7 @@
                 <w:sz w:val="19"/>
                 <w:szCs w:val="19"/>
               </w:rPr>
-              <w:t xml:space="preserve">System</w:t>
+              <w:t xml:space="preserve">System / host</w:t>
             </w:r>
           </w:p>
         </w:tc>
@@ -2106,7 +2106,7 @@
                 <w:sz w:val="19"/>
                 <w:szCs w:val="19"/>
               </w:rPr>
-              <w:t xml:space="preserve">WebMethods IS</w:t>
+              <w:t xml:space="preserve">MDTP</w:t>
             </w:r>
           </w:p>
         </w:tc>
@@ -2133,7 +2133,7 @@
                 <w:sz w:val="19"/>
                 <w:szCs w:val="19"/>
               </w:rPr>
-              <w:t xml:space="preserve">Incumbent broker/flows and drop-zones; source and target during coexistence; decommission target.</w:t>
+              <w:t xml:space="preserve">Digital tax platform; consumer/producer of managed file transfers.</w:t>
             </w:r>
           </w:p>
         </w:tc>
@@ -2162,7 +2162,7 @@
                 <w:sz w:val="19"/>
                 <w:szCs w:val="19"/>
               </w:rPr>
-              <w:t xml:space="preserve">ChRIS</w:t>
+              <w:t xml:space="preserve">SaaS systems (native iPaaS)</w:t>
             </w:r>
           </w:p>
         </w:tc>
@@ -2189,7 +2189,7 @@
                 <w:sz w:val="19"/>
                 <w:szCs w:val="19"/>
               </w:rPr>
-              <w:t xml:space="preserve">File-based exchange participant; consumer/producer of managed transfers.</w:t>
+              <w:t xml:space="preserve">Tax (S4H), CRM (CF/MSD), Workflow (Pega) and B&amp;T (CDS); exchange files via the iPaaS platform.</w:t>
             </w:r>
           </w:p>
         </w:tc>
@@ -2218,7 +2218,7 @@
                 <w:sz w:val="19"/>
                 <w:szCs w:val="19"/>
               </w:rPr>
-              <w:t xml:space="preserve">ETMP / NPS / DES</w:t>
+              <w:t xml:space="preserve">HoD applications</w:t>
             </w:r>
           </w:p>
         </w:tc>
@@ -2245,7 +2245,7 @@
                 <w:sz w:val="19"/>
                 <w:szCs w:val="19"/>
               </w:rPr>
-              <w:t xml:space="preserve">Systems of record; delivery/collection endpoints reached via Boomi connectors.</w:t>
+              <w:t xml:space="preserve">Heads-of-Duty applications hosted across AWS, Azure, Crown Hosting and Fujitsu; delivery/collection endpoints reached from the internal runtime.</w:t>
             </w:r>
           </w:p>
         </w:tc>
@@ -2274,7 +2274,7 @@
                 <w:sz w:val="19"/>
                 <w:szCs w:val="19"/>
               </w:rPr>
-              <w:t xml:space="preserve">HoD services</w:t>
+              <w:t xml:space="preserve">WebMethods IS</w:t>
             </w:r>
           </w:p>
         </w:tc>
@@ -2301,7 +2301,7 @@
                 <w:sz w:val="19"/>
                 <w:szCs w:val="19"/>
               </w:rPr>
-              <w:t xml:space="preserve">Head-of-Duty services participating in file-based flows.</w:t>
+              <w:t xml:space="preserve">Incumbent broker/flows and drop-zones; source and target during coexistence; decommission target.</w:t>
             </w:r>
           </w:p>
         </w:tc>
@@ -2330,7 +2330,7 @@
                 <w:sz w:val="19"/>
                 <w:szCs w:val="19"/>
               </w:rPr>
-              <w:t xml:space="preserve">External parties</w:t>
+              <w:t xml:space="preserve">External consumers / OGDs</w:t>
             </w:r>
           </w:p>
         </w:tc>
@@ -2357,7 +2357,7 @@
                 <w:sz w:val="19"/>
                 <w:szCs w:val="19"/>
               </w:rPr>
-              <w:t xml:space="preserve">OGDs, suppliers, agents and banks exchanging files over SFTP/FTPS/AS2.</w:t>
+              <w:t xml:space="preserve">Other government departments and 3rd-party consumers exchanging files over SFTP/FTPS/AS2.</w:t>
             </w:r>
           </w:p>
         </w:tc>
@@ -4409,7 +4409,7 @@
           <w:sz w:val="21"/>
           <w:szCs w:val="21"/>
         </w:rPr>
-        <w:t xml:space="preserve">The architecture is organised into five security zones plus a governance rail. The diagram below is the logical/deployment view; the editable source (draw.io) accompanies this document.</w:t>
+        <w:t xml:space="preserve">The architecture is aligned to the estate's logical view. Data moves from the external tier (cross-government consumers/OGDs, the digital tax platform MDTP, and the native-iPaaS SaaS systems) through the Boomi iPaaS Platform, across the external/internal trust boundary, into the Boomi internal runtime (the generic, config-driven MFT engine), and out to the Heads-of-Duty (HoD) applications hosted across AWS, Azure, Crown Hosting and Fujitsu. The diagram below is the logical/deployment view; the editable source (draw.io) accompanies this document.</w:t>
       </w:r>
     </w:p>
     <w:p>
@@ -4472,7 +4472,7 @@
           <w:sz w:val="18"/>
           <w:szCs w:val="18"/>
         </w:rPr>
-        <w:t xml:space="preserve">Figure 1 — MFT on Boomi: five-zone logical/deployment architecture</w:t>
+        <w:t xml:space="preserve">Figure 1 — MFT on Boomi: estate-aligned logical/deployment architecture</w:t>
       </w:r>
     </w:p>
     <w:p>
@@ -4489,7 +4489,7 @@
           <w:sz w:val="25"/>
           <w:szCs w:val="25"/>
         </w:rPr>
-        <w:t xml:space="preserve">7.1  Zones</w:t>
+        <w:t xml:space="preserve">7.1  Tiers</w:t>
       </w:r>
     </w:p>
     <w:tbl>
@@ -4505,8 +4505,8 @@
         </w:tblBorders>
       </w:tblPr>
       <w:tblGrid>
-        <w:gridCol w:w="2400"/>
-        <w:gridCol w:w="6626"/>
+        <w:gridCol w:w="2600"/>
+        <w:gridCol w:w="6426"/>
       </w:tblGrid>
       <w:tr>
         <w:trPr>
@@ -4514,7 +4514,7 @@
         </w:trPr>
         <w:tc>
           <w:tcPr>
-            <w:tcW w:type="dxa" w:w="2400"/>
+            <w:tcW w:type="dxa" w:w="2600"/>
             <w:shd w:fill="003D9E" w:color="auto" w:val="clear"/>
             <w:tcMar>
               <w:top w:type="dxa" w:w="60"/>
@@ -4537,13 +4537,13 @@
                 <w:sz w:val="19"/>
                 <w:szCs w:val="19"/>
               </w:rPr>
-              <w:t xml:space="preserve">Zone</w:t>
-            </w:r>
-          </w:p>
-        </w:tc>
-        <w:tc>
-          <w:tcPr>
-            <w:tcW w:type="dxa" w:w="6626"/>
+              <w:t xml:space="preserve">Tier</w:t>
+            </w:r>
+          </w:p>
+        </w:tc>
+        <w:tc>
+          <w:tcPr>
+            <w:tcW w:type="dxa" w:w="6426"/>
             <w:shd w:fill="003D9E" w:color="auto" w:val="clear"/>
             <w:tcMar>
               <w:top w:type="dxa" w:w="60"/>
@@ -4574,55 +4574,55 @@
       <w:tr>
         <w:tc>
           <w:tcPr>
-            <w:tcW w:type="dxa" w:w="2400"/>
-            <w:shd w:fill="FFFFFF" w:color="auto" w:val="clear"/>
-            <w:tcMar>
-              <w:top w:type="dxa" w:w="60"/>
-              <w:left w:type="dxa" w:w="90"/>
-              <w:bottom w:type="dxa" w:w="60"/>
-              <w:right w:type="dxa" w:w="90"/>
-            </w:tcMar>
-            <w:vAlign w:val="center"/>
-          </w:tcPr>
-          <w:p>
-            <w:pPr>
-              <w:spacing w:after="0" w:line="260"/>
-            </w:pPr>
-            <w:r>
-              <w:rPr>
-                <w:rFonts w:ascii="Calibri" w:cs="Calibri" w:eastAsia="Calibri" w:hAnsi="Calibri"/>
-                <w:color w:val="12161C"/>
-                <w:sz w:val="19"/>
-                <w:szCs w:val="19"/>
-              </w:rPr>
-              <w:t xml:space="preserve">1 — Trading partners</w:t>
-            </w:r>
-          </w:p>
-        </w:tc>
-        <w:tc>
-          <w:tcPr>
-            <w:tcW w:type="dxa" w:w="6626"/>
-            <w:shd w:fill="FFFFFF" w:color="auto" w:val="clear"/>
-            <w:tcMar>
-              <w:top w:type="dxa" w:w="60"/>
-              <w:left w:type="dxa" w:w="90"/>
-              <w:bottom w:type="dxa" w:w="60"/>
-              <w:right w:type="dxa" w:w="90"/>
-            </w:tcMar>
-            <w:vAlign w:val="center"/>
-          </w:tcPr>
-          <w:p>
-            <w:pPr>
-              <w:spacing w:after="0" w:line="260"/>
-            </w:pPr>
-            <w:r>
-              <w:rPr>
-                <w:rFonts w:ascii="Calibri" w:cs="Calibri" w:eastAsia="Calibri" w:hAnsi="Calibri"/>
-                <w:color w:val="12161C"/>
-                <w:sz w:val="19"/>
-                <w:szCs w:val="19"/>
-              </w:rPr>
-              <w:t xml:space="preserve">OGDs, suppliers, agents, banks and partner SFTP servers. Untrusted; internet-facing.</w:t>
+            <w:tcW w:type="dxa" w:w="2600"/>
+            <w:shd w:fill="FFFFFF" w:color="auto" w:val="clear"/>
+            <w:tcMar>
+              <w:top w:type="dxa" w:w="60"/>
+              <w:left w:type="dxa" w:w="90"/>
+              <w:bottom w:type="dxa" w:w="60"/>
+              <w:right w:type="dxa" w:w="90"/>
+            </w:tcMar>
+            <w:vAlign w:val="center"/>
+          </w:tcPr>
+          <w:p>
+            <w:pPr>
+              <w:spacing w:after="0" w:line="260"/>
+            </w:pPr>
+            <w:r>
+              <w:rPr>
+                <w:rFonts w:ascii="Calibri" w:cs="Calibri" w:eastAsia="Calibri" w:hAnsi="Calibri"/>
+                <w:color w:val="12161C"/>
+                <w:sz w:val="19"/>
+                <w:szCs w:val="19"/>
+              </w:rPr>
+              <w:t xml:space="preserve">External estate</w:t>
+            </w:r>
+          </w:p>
+        </w:tc>
+        <w:tc>
+          <w:tcPr>
+            <w:tcW w:type="dxa" w:w="6426"/>
+            <w:shd w:fill="FFFFFF" w:color="auto" w:val="clear"/>
+            <w:tcMar>
+              <w:top w:type="dxa" w:w="60"/>
+              <w:left w:type="dxa" w:w="90"/>
+              <w:bottom w:type="dxa" w:w="60"/>
+              <w:right w:type="dxa" w:w="90"/>
+            </w:tcMar>
+            <w:vAlign w:val="center"/>
+          </w:tcPr>
+          <w:p>
+            <w:pPr>
+              <w:spacing w:after="0" w:line="260"/>
+            </w:pPr>
+            <w:r>
+              <w:rPr>
+                <w:rFonts w:ascii="Calibri" w:cs="Calibri" w:eastAsia="Calibri" w:hAnsi="Calibri"/>
+                <w:color w:val="12161C"/>
+                <w:sz w:val="19"/>
+                <w:szCs w:val="19"/>
+              </w:rPr>
+              <w:t xml:space="preserve">Cross-government consumers and OGDs (3rd-party consumers), the digital tax platform (MDTP), and the SaaS systems that run on native iPaaS: Tax (S4H), CRM (CF/MSD), Workflow (Pega) and B&amp;T (CDS). Untrusted / edge-facing.</w:t>
             </w:r>
           </w:p>
         </w:tc>
@@ -4630,55 +4630,55 @@
       <w:tr>
         <w:tc>
           <w:tcPr>
-            <w:tcW w:type="dxa" w:w="2400"/>
-            <w:shd w:fill="F4F7FB" w:color="auto" w:val="clear"/>
-            <w:tcMar>
-              <w:top w:type="dxa" w:w="60"/>
-              <w:left w:type="dxa" w:w="90"/>
-              <w:bottom w:type="dxa" w:w="60"/>
-              <w:right w:type="dxa" w:w="90"/>
-            </w:tcMar>
-            <w:vAlign w:val="center"/>
-          </w:tcPr>
-          <w:p>
-            <w:pPr>
-              <w:spacing w:after="0" w:line="260"/>
-            </w:pPr>
-            <w:r>
-              <w:rPr>
-                <w:rFonts w:ascii="Calibri" w:cs="Calibri" w:eastAsia="Calibri" w:hAnsi="Calibri"/>
-                <w:color w:val="12161C"/>
-                <w:sz w:val="19"/>
-                <w:szCs w:val="19"/>
-              </w:rPr>
-              <w:t xml:space="preserve">2 — Edge / DMZ</w:t>
-            </w:r>
-          </w:p>
-        </w:tc>
-        <w:tc>
-          <w:tcPr>
-            <w:tcW w:type="dxa" w:w="6626"/>
-            <w:shd w:fill="F4F7FB" w:color="auto" w:val="clear"/>
-            <w:tcMar>
-              <w:top w:type="dxa" w:w="60"/>
-              <w:left w:type="dxa" w:w="90"/>
-              <w:bottom w:type="dxa" w:w="60"/>
-              <w:right w:type="dxa" w:w="90"/>
-            </w:tcMar>
-            <w:vAlign w:val="center"/>
-          </w:tcPr>
-          <w:p>
-            <w:pPr>
-              <w:spacing w:after="0" w:line="260"/>
-            </w:pPr>
-            <w:r>
-              <w:rPr>
-                <w:rFonts w:ascii="Calibri" w:cs="Calibri" w:eastAsia="Calibri" w:hAnsi="Calibri"/>
-                <w:color w:val="12161C"/>
-                <w:sz w:val="19"/>
-                <w:szCs w:val="19"/>
-              </w:rPr>
-              <w:t xml:space="preserve">Load balancer/WAF and Boomi MFT cloud components (protocol listeners, partner endpoints). Protocol termination; no persistent payload storage.</w:t>
+            <w:tcW w:type="dxa" w:w="2600"/>
+            <w:shd w:fill="F4F7FB" w:color="auto" w:val="clear"/>
+            <w:tcMar>
+              <w:top w:type="dxa" w:w="60"/>
+              <w:left w:type="dxa" w:w="90"/>
+              <w:bottom w:type="dxa" w:w="60"/>
+              <w:right w:type="dxa" w:w="90"/>
+            </w:tcMar>
+            <w:vAlign w:val="center"/>
+          </w:tcPr>
+          <w:p>
+            <w:pPr>
+              <w:spacing w:after="0" w:line="260"/>
+            </w:pPr>
+            <w:r>
+              <w:rPr>
+                <w:rFonts w:ascii="Calibri" w:cs="Calibri" w:eastAsia="Calibri" w:hAnsi="Calibri"/>
+                <w:color w:val="12161C"/>
+                <w:sz w:val="19"/>
+                <w:szCs w:val="19"/>
+              </w:rPr>
+              <w:t xml:space="preserve">Boomi iPaaS Platform</w:t>
+            </w:r>
+          </w:p>
+        </w:tc>
+        <w:tc>
+          <w:tcPr>
+            <w:tcW w:type="dxa" w:w="6426"/>
+            <w:shd w:fill="F4F7FB" w:color="auto" w:val="clear"/>
+            <w:tcMar>
+              <w:top w:type="dxa" w:w="60"/>
+              <w:left w:type="dxa" w:w="90"/>
+              <w:bottom w:type="dxa" w:w="60"/>
+              <w:right w:type="dxa" w:w="90"/>
+            </w:tcMar>
+            <w:vAlign w:val="center"/>
+          </w:tcPr>
+          <w:p>
+            <w:pPr>
+              <w:spacing w:after="0" w:line="260"/>
+            </w:pPr>
+            <w:r>
+              <w:rPr>
+                <w:rFonts w:ascii="Calibri" w:cs="Calibri" w:eastAsia="Calibri" w:hAnsi="Calibri"/>
+                <w:color w:val="12161C"/>
+                <w:sz w:val="19"/>
+                <w:szCs w:val="19"/>
+              </w:rPr>
+              <w:t xml:space="preserve">External-facing runtime / control plane: MFT cloud components (SFTP/FTPS/AS2 listeners, trading-partner endpoints), managed landing zones, tracking/audit, scheduling, key &amp; certificate store, observability (OTel) and RBAC. Confirm UK region for OFFICIAL.</w:t>
             </w:r>
           </w:p>
         </w:tc>
@@ -4686,55 +4686,55 @@
       <w:tr>
         <w:tc>
           <w:tcPr>
-            <w:tcW w:type="dxa" w:w="2400"/>
-            <w:shd w:fill="FFFFFF" w:color="auto" w:val="clear"/>
-            <w:tcMar>
-              <w:top w:type="dxa" w:w="60"/>
-              <w:left w:type="dxa" w:w="90"/>
-              <w:bottom w:type="dxa" w:w="60"/>
-              <w:right w:type="dxa" w:w="90"/>
-            </w:tcMar>
-            <w:vAlign w:val="center"/>
-          </w:tcPr>
-          <w:p>
-            <w:pPr>
-              <w:spacing w:after="0" w:line="260"/>
-            </w:pPr>
-            <w:r>
-              <w:rPr>
-                <w:rFonts w:ascii="Calibri" w:cs="Calibri" w:eastAsia="Calibri" w:hAnsi="Calibri"/>
-                <w:color w:val="12161C"/>
-                <w:sz w:val="19"/>
-                <w:szCs w:val="19"/>
-              </w:rPr>
-              <w:t xml:space="preserve">3 — Boomi control plane (SaaS)</w:t>
-            </w:r>
-          </w:p>
-        </w:tc>
-        <w:tc>
-          <w:tcPr>
-            <w:tcW w:type="dxa" w:w="6626"/>
-            <w:shd w:fill="FFFFFF" w:color="auto" w:val="clear"/>
-            <w:tcMar>
-              <w:top w:type="dxa" w:w="60"/>
-              <w:left w:type="dxa" w:w="90"/>
-              <w:bottom w:type="dxa" w:w="60"/>
-              <w:right w:type="dxa" w:w="90"/>
-            </w:tcMar>
-            <w:vAlign w:val="center"/>
-          </w:tcPr>
-          <w:p>
-            <w:pPr>
-              <w:spacing w:after="0" w:line="260"/>
-            </w:pPr>
-            <w:r>
-              <w:rPr>
-                <w:rFonts w:ascii="Calibri" w:cs="Calibri" w:eastAsia="Calibri" w:hAnsi="Calibri"/>
-                <w:color w:val="12161C"/>
-                <w:sz w:val="19"/>
-                <w:szCs w:val="19"/>
-              </w:rPr>
-              <w:t xml:space="preserve">MFT management (Orgs/Endpoints/Flows), tracking/audit, scheduling, key &amp; certificate store, observability, RBAC. Confirm UK region for OFFICIAL.</w:t>
+            <w:tcW w:type="dxa" w:w="2600"/>
+            <w:shd w:fill="FFFFFF" w:color="auto" w:val="clear"/>
+            <w:tcMar>
+              <w:top w:type="dxa" w:w="60"/>
+              <w:left w:type="dxa" w:w="90"/>
+              <w:bottom w:type="dxa" w:w="60"/>
+              <w:right w:type="dxa" w:w="90"/>
+            </w:tcMar>
+            <w:vAlign w:val="center"/>
+          </w:tcPr>
+          <w:p>
+            <w:pPr>
+              <w:spacing w:after="0" w:line="260"/>
+            </w:pPr>
+            <w:r>
+              <w:rPr>
+                <w:rFonts w:ascii="Calibri" w:cs="Calibri" w:eastAsia="Calibri" w:hAnsi="Calibri"/>
+                <w:color w:val="12161C"/>
+                <w:sz w:val="19"/>
+                <w:szCs w:val="19"/>
+              </w:rPr>
+              <w:t xml:space="preserve">Trust boundary</w:t>
+            </w:r>
+          </w:p>
+        </w:tc>
+        <w:tc>
+          <w:tcPr>
+            <w:tcW w:type="dxa" w:w="6426"/>
+            <w:shd w:fill="FFFFFF" w:color="auto" w:val="clear"/>
+            <w:tcMar>
+              <w:top w:type="dxa" w:w="60"/>
+              <w:left w:type="dxa" w:w="90"/>
+              <w:bottom w:type="dxa" w:w="60"/>
+              <w:right w:type="dxa" w:w="90"/>
+            </w:tcMar>
+            <w:vAlign w:val="center"/>
+          </w:tcPr>
+          <w:p>
+            <w:pPr>
+              <w:spacing w:after="0" w:line="260"/>
+            </w:pPr>
+            <w:r>
+              <w:rPr>
+                <w:rFonts w:ascii="Calibri" w:cs="Calibri" w:eastAsia="Calibri" w:hAnsi="Calibri"/>
+                <w:color w:val="12161C"/>
+                <w:sz w:val="19"/>
+                <w:szCs w:val="19"/>
+              </w:rPr>
+              <w:t xml:space="preserve">The external/internal separation. Payloads are kept within the trusted boundary; only control/tracking metadata surfaces to the platform.</w:t>
             </w:r>
           </w:p>
         </w:tc>
@@ -4742,55 +4742,55 @@
       <w:tr>
         <w:tc>
           <w:tcPr>
-            <w:tcW w:type="dxa" w:w="2400"/>
-            <w:shd w:fill="F4F7FB" w:color="auto" w:val="clear"/>
-            <w:tcMar>
-              <w:top w:type="dxa" w:w="60"/>
-              <w:left w:type="dxa" w:w="90"/>
-              <w:bottom w:type="dxa" w:w="60"/>
-              <w:right w:type="dxa" w:w="90"/>
-            </w:tcMar>
-            <w:vAlign w:val="center"/>
-          </w:tcPr>
-          <w:p>
-            <w:pPr>
-              <w:spacing w:after="0" w:line="260"/>
-            </w:pPr>
-            <w:r>
-              <w:rPr>
-                <w:rFonts w:ascii="Calibri" w:cs="Calibri" w:eastAsia="Calibri" w:hAnsi="Calibri"/>
-                <w:color w:val="12161C"/>
-                <w:sz w:val="19"/>
-                <w:szCs w:val="19"/>
-              </w:rPr>
-              <w:t xml:space="preserve">4 — Runtime (trusted)</w:t>
-            </w:r>
-          </w:p>
-        </w:tc>
-        <w:tc>
-          <w:tcPr>
-            <w:tcW w:type="dxa" w:w="6626"/>
-            <w:shd w:fill="F4F7FB" w:color="auto" w:val="clear"/>
-            <w:tcMar>
-              <w:top w:type="dxa" w:w="60"/>
-              <w:left w:type="dxa" w:w="90"/>
-              <w:bottom w:type="dxa" w:w="60"/>
-              <w:right w:type="dxa" w:w="90"/>
-            </w:tcMar>
-            <w:vAlign w:val="center"/>
-          </w:tcPr>
-          <w:p>
-            <w:pPr>
-              <w:spacing w:after="0" w:line="260"/>
-            </w:pPr>
-            <w:r>
-              <w:rPr>
-                <w:rFonts w:ascii="Calibri" w:cs="Calibri" w:eastAsia="Calibri" w:hAnsi="Calibri"/>
-                <w:color w:val="12161C"/>
-                <w:sz w:val="19"/>
-                <w:szCs w:val="19"/>
-              </w:rPr>
-              <w:t xml:space="preserve">Customer-managed MFT runtimes (on-prem/hybrid), Molecule HA cluster, the generic MFT engine process, the MFT Connector, and the config/routing DB. Payload stays in boundary.</w:t>
+            <w:tcW w:type="dxa" w:w="2600"/>
+            <w:shd w:fill="F4F7FB" w:color="auto" w:val="clear"/>
+            <w:tcMar>
+              <w:top w:type="dxa" w:w="60"/>
+              <w:left w:type="dxa" w:w="90"/>
+              <w:bottom w:type="dxa" w:w="60"/>
+              <w:right w:type="dxa" w:w="90"/>
+            </w:tcMar>
+            <w:vAlign w:val="center"/>
+          </w:tcPr>
+          <w:p>
+            <w:pPr>
+              <w:spacing w:after="0" w:line="260"/>
+            </w:pPr>
+            <w:r>
+              <w:rPr>
+                <w:rFonts w:ascii="Calibri" w:cs="Calibri" w:eastAsia="Calibri" w:hAnsi="Calibri"/>
+                <w:color w:val="12161C"/>
+                <w:sz w:val="19"/>
+                <w:szCs w:val="19"/>
+              </w:rPr>
+              <w:t xml:space="preserve">Boomi internal runtime</w:t>
+            </w:r>
+          </w:p>
+        </w:tc>
+        <w:tc>
+          <w:tcPr>
+            <w:tcW w:type="dxa" w:w="6426"/>
+            <w:shd w:fill="F4F7FB" w:color="auto" w:val="clear"/>
+            <w:tcMar>
+              <w:top w:type="dxa" w:w="60"/>
+              <w:left w:type="dxa" w:w="90"/>
+              <w:bottom w:type="dxa" w:w="60"/>
+              <w:right w:type="dxa" w:w="90"/>
+            </w:tcMar>
+            <w:vAlign w:val="center"/>
+          </w:tcPr>
+          <w:p>
+            <w:pPr>
+              <w:spacing w:after="0" w:line="260"/>
+            </w:pPr>
+            <w:r>
+              <w:rPr>
+                <w:rFonts w:ascii="Calibri" w:cs="Calibri" w:eastAsia="Calibri" w:hAnsi="Calibri"/>
+                <w:color w:val="12161C"/>
+                <w:sz w:val="19"/>
+                <w:szCs w:val="19"/>
+              </w:rPr>
+              <w:t xml:space="preserve">Customer-managed runtime in the trusted zone: the generic, config-driven MFT engine, Molecule HA cluster, the MFT Connector, and the config/routing DB.</w:t>
             </w:r>
           </w:p>
         </w:tc>
@@ -4798,55 +4798,55 @@
       <w:tr>
         <w:tc>
           <w:tcPr>
-            <w:tcW w:type="dxa" w:w="2400"/>
-            <w:shd w:fill="FFFFFF" w:color="auto" w:val="clear"/>
-            <w:tcMar>
-              <w:top w:type="dxa" w:w="60"/>
-              <w:left w:type="dxa" w:w="90"/>
-              <w:bottom w:type="dxa" w:w="60"/>
-              <w:right w:type="dxa" w:w="90"/>
-            </w:tcMar>
-            <w:vAlign w:val="center"/>
-          </w:tcPr>
-          <w:p>
-            <w:pPr>
-              <w:spacing w:after="0" w:line="260"/>
-            </w:pPr>
-            <w:r>
-              <w:rPr>
-                <w:rFonts w:ascii="Calibri" w:cs="Calibri" w:eastAsia="Calibri" w:hAnsi="Calibri"/>
-                <w:color w:val="12161C"/>
-                <w:sz w:val="19"/>
-                <w:szCs w:val="19"/>
-              </w:rPr>
-              <w:t xml:space="preserve">5 — Data zone</w:t>
-            </w:r>
-          </w:p>
-        </w:tc>
-        <w:tc>
-          <w:tcPr>
-            <w:tcW w:type="dxa" w:w="6626"/>
-            <w:shd w:fill="FFFFFF" w:color="auto" w:val="clear"/>
-            <w:tcMar>
-              <w:top w:type="dxa" w:w="60"/>
-              <w:left w:type="dxa" w:w="90"/>
-              <w:bottom w:type="dxa" w:w="60"/>
-              <w:right w:type="dxa" w:w="90"/>
-            </w:tcMar>
-            <w:vAlign w:val="center"/>
-          </w:tcPr>
-          <w:p>
-            <w:pPr>
-              <w:spacing w:after="0" w:line="260"/>
-            </w:pPr>
-            <w:r>
-              <w:rPr>
-                <w:rFonts w:ascii="Calibri" w:cs="Calibri" w:eastAsia="Calibri" w:hAnsi="Calibri"/>
-                <w:color w:val="12161C"/>
-                <w:sz w:val="19"/>
-                <w:szCs w:val="19"/>
-              </w:rPr>
-              <w:t xml:space="preserve">Systems of record (ETMP, NPS, DES, ChRIS, HoD) and WebMethods during coexistence.</w:t>
+            <w:tcW w:type="dxa" w:w="2600"/>
+            <w:shd w:fill="FFFFFF" w:color="auto" w:val="clear"/>
+            <w:tcMar>
+              <w:top w:type="dxa" w:w="60"/>
+              <w:left w:type="dxa" w:w="90"/>
+              <w:bottom w:type="dxa" w:w="60"/>
+              <w:right w:type="dxa" w:w="90"/>
+            </w:tcMar>
+            <w:vAlign w:val="center"/>
+          </w:tcPr>
+          <w:p>
+            <w:pPr>
+              <w:spacing w:after="0" w:line="260"/>
+            </w:pPr>
+            <w:r>
+              <w:rPr>
+                <w:rFonts w:ascii="Calibri" w:cs="Calibri" w:eastAsia="Calibri" w:hAnsi="Calibri"/>
+                <w:color w:val="12161C"/>
+                <w:sz w:val="19"/>
+                <w:szCs w:val="19"/>
+              </w:rPr>
+              <w:t xml:space="preserve">Internal hosted estate</w:t>
+            </w:r>
+          </w:p>
+        </w:tc>
+        <w:tc>
+          <w:tcPr>
+            <w:tcW w:type="dxa" w:w="6426"/>
+            <w:shd w:fill="FFFFFF" w:color="auto" w:val="clear"/>
+            <w:tcMar>
+              <w:top w:type="dxa" w:w="60"/>
+              <w:left w:type="dxa" w:w="90"/>
+              <w:bottom w:type="dxa" w:w="60"/>
+              <w:right w:type="dxa" w:w="90"/>
+            </w:tcMar>
+            <w:vAlign w:val="center"/>
+          </w:tcPr>
+          <w:p>
+            <w:pPr>
+              <w:spacing w:after="0" w:line="260"/>
+            </w:pPr>
+            <w:r>
+              <w:rPr>
+                <w:rFonts w:ascii="Calibri" w:cs="Calibri" w:eastAsia="Calibri" w:hAnsi="Calibri"/>
+                <w:color w:val="12161C"/>
+                <w:sz w:val="19"/>
+                <w:szCs w:val="19"/>
+              </w:rPr>
+              <w:t xml:space="preserve">HoD applications hosted across AWS, Azure, Crown Hosting and Fujitsu, plus WebMethods during coexistence.</w:t>
             </w:r>
           </w:p>
         </w:tc>
@@ -5208,7 +5208,7 @@
           <w:sz w:val="25"/>
           <w:szCs w:val="25"/>
         </w:rPr>
-        <w:t xml:space="preserve">8.1  Connectivity to systems of record</w:t>
+        <w:t xml:space="preserve">8.1  Connectivity to estate systems</w:t>
       </w:r>
     </w:p>
     <w:p>
@@ -5222,7 +5222,7 @@
           <w:sz w:val="21"/>
           <w:szCs w:val="21"/>
         </w:rPr>
-        <w:t xml:space="preserve">The generic engine reaches ETMP, NPS, DES, ChRIS and HoD services through Boomi connectors (SFTP, database, JMS/queue, HTTP) from the trusted runtime zone. Payloads remain within the boundary; only control/tracking metadata surfaces to the control plane.</w:t>
+        <w:t xml:space="preserve">The Boomi internal runtime reaches the HoD applications (hosted across AWS, Azure, Crown Hosting and Fujitsu) and integrates with MDTP and the SaaS systems (S4H, CF/MSD, Pega, CDS) through Boomi connectors (SFTP, database, JMS/queue, HTTP) from the trusted zone. Payloads remain within the boundary; only control/tracking metadata surfaces to the iPaaS platform.</w:t>
       </w:r>
     </w:p>
     <w:p>

</xml_diff>

<commit_message>
Show MFT integrated with the Integration & API-management platform. Fig 1 enriched (API Control Plane, Developer Portal, Integration Flow Designer/Runtime, Cloud API Management, external/internal API gateways, Kong) with the Boomi MFT Connector bridging integration flows to the config-driven MFT engine; API-executions vs config/deploy channels. New Fig 2: MFT<->Integration Platform connector mechanism (control vs data channels, direct file exchange, orchestration/reporting). Word/Excel/HTML updated; docs.zip rebuilt.
</commit_message>
<xml_diff>
--- a/assets/boomi-mft-solution-design-document.docx
+++ b/assets/boomi-mft-solution-design-document.docx
@@ -4420,7 +4420,7 @@
       <w:r>
         <w:drawing>
           <wp:inline distT="0" distB="0" distL="0" distR="0">
-            <wp:extent cx="6096000" cy="4219575"/>
+            <wp:extent cx="6286500" cy="4714875"/>
             <wp:effectExtent t="0" r="0" b="0" l="0"/>
             <wp:docPr id="1" name="" descr="" title=""/>
             <wp:cNvGraphicFramePr>
@@ -4445,7 +4445,7 @@
                   <pic:spPr bwMode="auto">
                     <a:xfrm>
                       <a:off x="0" y="0"/>
-                      <a:ext cx="6096000" cy="4219575"/>
+                      <a:ext cx="6286500" cy="4714875"/>
                     </a:xfrm>
                     <a:prstGeom prst="rect">
                       <a:avLst/>
@@ -5172,6 +5172,226 @@
         <w:t xml:space="preserve">SSH keys, PGP keypairs and TLS certificates are held in the platform key/certificate store and referenced by configuration. Custody, rotation and integration with an enterprise HSM/KMS are to be confirmed as a security dependency (Section 14).</w:t>
       </w:r>
     </w:p>
+    <w:p>
+      <w:pPr>
+        <w:pStyle w:val="Heading2"/>
+        <w:spacing w:after="100" w:before="200"/>
+      </w:pPr>
+      <w:r>
+        <w:rPr>
+          <w:rFonts w:ascii="Calibri" w:cs="Calibri" w:eastAsia="Calibri" w:hAnsi="Calibri"/>
+          <w:b/>
+          <w:bCs/>
+          <w:color w:val="12161C"/>
+          <w:sz w:val="25"/>
+          <w:szCs w:val="25"/>
+        </w:rPr>
+        <w:t xml:space="preserve">7.5  Integrating MFT with the Integration Platform</w:t>
+      </w:r>
+    </w:p>
+    <w:p>
+      <w:pPr>
+        <w:spacing w:after="120" w:before="0" w:line="276"/>
+      </w:pPr>
+      <w:r>
+        <w:rPr>
+          <w:rFonts w:ascii="Calibri" w:cs="Calibri" w:eastAsia="Calibri" w:hAnsi="Calibri"/>
+          <w:color w:val="12161C"/>
+          <w:sz w:val="21"/>
+          <w:szCs w:val="21"/>
+        </w:rPr>
+        <w:t xml:space="preserve">MFT is not a silo: it runs inside the same Boomi platform as the Integration and API-management capabilities, and is driven by them. The two are wired together by the Boomi MFT Connector, which lets an integration process invoke MFT file-transfer flows. This means a file transfer can be triggered and orchestrated by business logic (an event or schedule), while MFT itself moves the bytes over SFTP/FTPS and records the audit trail — one platform, one governance model, one audit history.</w:t>
+      </w:r>
+    </w:p>
+    <w:p>
+      <w:pPr>
+        <w:spacing w:after="40" w:before="60"/>
+        <w:jc w:val="center"/>
+      </w:pPr>
+      <w:r>
+        <w:drawing>
+          <wp:inline distT="0" distB="0" distL="0" distR="0">
+            <wp:extent cx="6286500" cy="4057650"/>
+            <wp:effectExtent t="0" r="0" b="0" l="0"/>
+            <wp:docPr id="1" name="" descr="" title=""/>
+            <wp:cNvGraphicFramePr>
+              <a:graphicFrameLocks xmlns:a="http://schemas.openxmlformats.org/drawingml/2006/main" noChangeAspect="1"/>
+            </wp:cNvGraphicFramePr>
+            <a:graphic xmlns:a="http://schemas.openxmlformats.org/drawingml/2006/main">
+              <a:graphicData uri="http://schemas.openxmlformats.org/drawingml/2006/picture">
+                <pic:pic xmlns:pic="http://schemas.openxmlformats.org/drawingml/2006/picture">
+                  <pic:nvPicPr>
+                    <pic:cNvPr id="0" name="" descr=""/>
+                    <pic:cNvPicPr>
+                      <a:picLocks noChangeAspect="1" noChangeArrowheads="1"/>
+                    </pic:cNvPicPr>
+                  </pic:nvPicPr>
+                  <pic:blipFill>
+                    <a:blip r:embed="rId10" cstate="none"/>
+                    <a:srcRect/>
+                    <a:stretch>
+                      <a:fillRect/>
+                    </a:stretch>
+                  </pic:blipFill>
+                  <pic:spPr bwMode="auto">
+                    <a:xfrm>
+                      <a:off x="0" y="0"/>
+                      <a:ext cx="6286500" cy="4057650"/>
+                    </a:xfrm>
+                    <a:prstGeom prst="rect">
+                      <a:avLst/>
+                    </a:prstGeom>
+                  </pic:spPr>
+                </pic:pic>
+              </a:graphicData>
+            </a:graphic>
+          </wp:inline>
+        </w:drawing>
+      </w:r>
+    </w:p>
+    <w:p>
+      <w:pPr>
+        <w:spacing w:after="160"/>
+        <w:jc w:val="center"/>
+      </w:pPr>
+      <w:r>
+        <w:rPr>
+          <w:rFonts w:ascii="Calibri" w:cs="Calibri" w:eastAsia="Calibri" w:hAnsi="Calibri"/>
+          <w:i/>
+          <w:iCs/>
+          <w:color w:val="5A6472"/>
+          <w:sz w:val="18"/>
+          <w:szCs w:val="18"/>
+        </w:rPr>
+        <w:t xml:space="preserve">Figure 2 — MFT ↔ Integration Platform: the Boomi MFT Connector (event-driven transfer, control &amp; data channels)</w:t>
+      </w:r>
+    </w:p>
+    <w:p>
+      <w:pPr>
+        <w:spacing w:after="120" w:before="0" w:line="276"/>
+      </w:pPr>
+      <w:r>
+        <w:rPr>
+          <w:rFonts w:ascii="Calibri" w:cs="Calibri" w:eastAsia="Calibri" w:hAnsi="Calibri"/>
+          <w:color w:val="12161C"/>
+          <w:sz w:val="21"/>
+          <w:szCs w:val="21"/>
+        </w:rPr>
+        <w:t xml:space="preserve">The integration works across two distinct channels, which the design keeps separate:</w:t>
+      </w:r>
+    </w:p>
+    <w:p>
+      <w:pPr>
+        <w:pStyle w:val="ListParagraph"/>
+        <w:numPr>
+          <w:ilvl w:val="0"/>
+          <w:numId w:val="1"/>
+        </w:numPr>
+        <w:spacing w:after="60" w:line="268"/>
+      </w:pPr>
+      <w:r>
+        <w:rPr>
+          <w:rFonts w:ascii="Calibri" w:cs="Calibri" w:eastAsia="Calibri" w:hAnsi="Calibri"/>
+          <w:color w:val="12161C"/>
+          <w:sz w:val="21"/>
+          <w:szCs w:val="21"/>
+        </w:rPr>
+        <w:t xml:space="preserve">Control channel — an event trigger or schedule in an integration process starts the transfer, and MFT exposes APIs the platform uses for status and reporting. This is the “orchestration &amp; reporting” path, carried over REST.</w:t>
+      </w:r>
+    </w:p>
+    <w:p>
+      <w:pPr>
+        <w:pStyle w:val="ListParagraph"/>
+        <w:numPr>
+          <w:ilvl w:val="0"/>
+          <w:numId w:val="1"/>
+        </w:numPr>
+        <w:spacing w:after="60" w:line="268"/>
+      </w:pPr>
+      <w:r>
+        <w:rPr>
+          <w:rFonts w:ascii="Calibri" w:cs="Calibri" w:eastAsia="Calibri" w:hAnsi="Calibri"/>
+          <w:color w:val="12161C"/>
+          <w:sz w:val="21"/>
+          <w:szCs w:val="21"/>
+        </w:rPr>
+        <w:t xml:space="preserve">Data channels — MFT performs the actual file movement over SFTP/FTPS/AS2 to and from partner servers and cloud storage (source and target data channels), and can exchange files directly with internal file repositories (direct file exchange).</w:t>
+      </w:r>
+    </w:p>
+    <w:p>
+      <w:pPr>
+        <w:spacing w:after="120" w:before="0" w:line="276"/>
+      </w:pPr>
+      <w:r>
+        <w:rPr>
+          <w:rFonts w:ascii="Calibri" w:cs="Calibri" w:eastAsia="Calibri" w:hAnsi="Calibri"/>
+          <w:color w:val="12161C"/>
+          <w:sz w:val="21"/>
+          <w:szCs w:val="21"/>
+        </w:rPr>
+        <w:t xml:space="preserve">The same API-management layer (Cloud API Management, and the external/internal API gateways) can front the MFT and integration APIs, so consumers and internal HoD applications reach them through governed, secured gateways rather than point-to-point. Two flow types are distinguished throughout the architecture: API executions (the runtime request/transfer path) and configurations/deployments (the control path by which the API Control Plane, Developer Portal, Integration Flow Designer and CAM push definitions to the runtimes).</w:t>
+      </w:r>
+    </w:p>
+    <w:tbl>
+      <w:tblPr>
+        <w:tblW w:type="dxa" w:w="9026"/>
+        <w:tblBorders>
+          <w:top w:val="none"/>
+          <w:left w:val="single" w:color="B3261E" w:sz="18"/>
+          <w:bottom w:val="none"/>
+          <w:right w:val="none"/>
+          <w:insideH w:val="none"/>
+          <w:insideV w:val="none"/>
+        </w:tblBorders>
+      </w:tblPr>
+      <w:tblGrid>
+        <w:gridCol w:w="9026"/>
+      </w:tblGrid>
+      <w:tr>
+        <w:tc>
+          <w:tcPr>
+            <w:tcW w:type="dxa" w:w="9026"/>
+            <w:shd w:fill="FDECEA" w:color="auto" w:val="clear"/>
+            <w:tcMar>
+              <w:top w:type="dxa" w:w="100"/>
+              <w:left w:type="dxa" w:w="160"/>
+              <w:bottom w:type="dxa" w:w="100"/>
+              <w:right w:type="dxa" w:w="140"/>
+            </w:tcMar>
+          </w:tcPr>
+          <w:p>
+            <w:pPr>
+              <w:spacing w:after="40"/>
+            </w:pPr>
+            <w:r>
+              <w:rPr>
+                <w:rFonts w:ascii="Calibri" w:cs="Calibri" w:eastAsia="Calibri" w:hAnsi="Calibri"/>
+                <w:b/>
+                <w:bCs/>
+                <w:color w:val="B3261E"/>
+                <w:sz w:val="20"/>
+                <w:szCs w:val="20"/>
+              </w:rPr>
+              <w:t xml:space="preserve">Design guardrail — integration must not become construction</w:t>
+            </w:r>
+          </w:p>
+          <w:p>
+            <w:pPr>
+              <w:spacing w:after="20" w:line="264"/>
+            </w:pPr>
+            <w:r>
+              <w:rPr>
+                <w:rFonts w:ascii="Calibri" w:cs="Calibri" w:eastAsia="Calibri" w:hAnsi="Calibri"/>
+                <w:color w:val="12161C"/>
+                <w:sz w:val="19"/>
+                <w:szCs w:val="19"/>
+              </w:rPr>
+              <w:t xml:space="preserve">Invoking MFT from an integration process is fully consistent with config over construction only while each transfer remains a configuration row consumed by the generic engine. Bespoke per-interface integration processes that embed transfer logic would re-introduce build cost and must be raised to the Design Authority with a named owner (Section 14).</w:t>
+            </w:r>
+          </w:p>
+        </w:tc>
+      </w:tr>
+    </w:tbl>
     <w:p>
       <w:r>
         <w:br w:type="page"/>

</xml_diff>

<commit_message>
Re-tier Figure 1 into a clean top-to-bottom stack: Tier 1 Consumers → Tier 2 Cloud integration layer (Boomi iPaaS incl. MFT cloud) → trust boundary → Tier 3 Runtime integration layer (incl. config-driven MFT engine + Boomi MFT Connector + internal API gateways) → Tier 4 backend/HMRC systems (HoD apps on AWS/Azure/Crown Hosting/Fujitsu). Word + HTML tier narratives/tables realigned; draw.io keeps HMRC tier labels; docs.zip rebuilt.
</commit_message>
<xml_diff>
--- a/assets/boomi-mft-solution-design-document.docx
+++ b/assets/boomi-mft-solution-design-document.docx
@@ -4409,7 +4409,7 @@
           <w:sz w:val="21"/>
           <w:szCs w:val="21"/>
         </w:rPr>
-        <w:t xml:space="preserve">The architecture is aligned to the estate's logical view. Data moves from the external tier (cross-government consumers/OGDs, the digital tax platform MDTP, and the native-iPaaS SaaS systems) through the Boomi iPaaS Platform, across the external/internal trust boundary, into the Boomi internal runtime (the generic, config-driven MFT engine), and out to the Heads-of-Duty (HoD) applications hosted across AWS, Azure, Crown Hosting and Fujitsu. The diagram below is the logical/deployment view; the editable source (draw.io) accompanies this document.</w:t>
+        <w:t xml:space="preserve">The architecture is presented as four horizontal tiers, top to bottom: consumers, the cloud integration layer, the runtime integration layer, and the backend systems. MFT appears in both integration layers — as cloud components in Tier 2 and as the config-driven engine in Tier 3 — so the file-transfer capability is delivered by the same platform, and governed the same way, as the wider integration and API estate. The diagram below is the logical/deployment view; the editable source (draw.io) accompanies this document.</w:t>
       </w:r>
     </w:p>
     <w:p>
@@ -4420,7 +4420,7 @@
       <w:r>
         <w:drawing>
           <wp:inline distT="0" distB="0" distL="0" distR="0">
-            <wp:extent cx="6286500" cy="4714875"/>
+            <wp:extent cx="5905500" cy="4810125"/>
             <wp:effectExtent t="0" r="0" b="0" l="0"/>
             <wp:docPr id="1" name="" descr="" title=""/>
             <wp:cNvGraphicFramePr>
@@ -4445,7 +4445,7 @@
                   <pic:spPr bwMode="auto">
                     <a:xfrm>
                       <a:off x="0" y="0"/>
-                      <a:ext cx="6286500" cy="4714875"/>
+                      <a:ext cx="5905500" cy="4810125"/>
                     </a:xfrm>
                     <a:prstGeom prst="rect">
                       <a:avLst/>
@@ -4472,7 +4472,7 @@
           <w:sz w:val="18"/>
           <w:szCs w:val="18"/>
         </w:rPr>
-        <w:t xml:space="preserve">Figure 1 — MFT on Boomi: estate-aligned logical/deployment architecture</w:t>
+        <w:t xml:space="preserve">Figure 1 — MFT on Boomi: tiered architecture (consumers → cloud → runtime → systems)</w:t>
       </w:r>
     </w:p>
     <w:p>
@@ -4595,7 +4595,7 @@
                 <w:sz w:val="19"/>
                 <w:szCs w:val="19"/>
               </w:rPr>
-              <w:t xml:space="preserve">External estate</w:t>
+              <w:t xml:space="preserve">Tier 1 — Consumers</w:t>
             </w:r>
           </w:p>
         </w:tc>
@@ -4622,7 +4622,7 @@
                 <w:sz w:val="19"/>
                 <w:szCs w:val="19"/>
               </w:rPr>
-              <w:t xml:space="preserve">Cross-government consumers and OGDs (3rd-party consumers), the digital tax platform (MDTP), and the SaaS systems that run on native iPaaS: Tax (S4H), CRM (CF/MSD), Workflow (Pega) and B&amp;T (CDS). Untrusted / edge-facing.</w:t>
+              <w:t xml:space="preserve">The external, cross-government, digital and SaaS systems that consume and produce transfers: 3rd-party consumers/OGDs, the digital tax platform (MDTP), and the native-iPaaS SaaS systems Tax (S4H), CRM (CF/MSD), Workflow (Pega) and B&amp;T (CDS).</w:t>
             </w:r>
           </w:p>
         </w:tc>
@@ -4651,7 +4651,7 @@
                 <w:sz w:val="19"/>
                 <w:szCs w:val="19"/>
               </w:rPr>
-              <w:t xml:space="preserve">Boomi iPaaS Platform</w:t>
+              <w:t xml:space="preserve">Tier 2 — Cloud integration layer (incl. MFT)</w:t>
             </w:r>
           </w:p>
         </w:tc>
@@ -4678,7 +4678,7 @@
                 <w:sz w:val="19"/>
                 <w:szCs w:val="19"/>
               </w:rPr>
-              <w:t xml:space="preserve">External-facing runtime / control plane: MFT cloud components (SFTP/FTPS/AS2 listeners, trading-partner endpoints), managed landing zones, tracking/audit, scheduling, key &amp; certificate store, observability (OTel) and RBAC. Confirm UK region for OFFICIAL.</w:t>
+              <w:t xml:space="preserve">The Boomi iPaaS SaaS control plane: Integration &amp; API management (API Control Plane, Developer Portal(s), Integration Flow Designer, Cloud API Management, external API gateway) alongside the MFT cloud components (SFTP/FTPS/AS2 listeners, landing zones, tracking/audit, keys, scheduling, OTel, RBAC). Confirm UK region for OFFICIAL.</w:t>
             </w:r>
           </w:p>
         </w:tc>
@@ -4734,7 +4734,7 @@
                 <w:sz w:val="19"/>
                 <w:szCs w:val="19"/>
               </w:rPr>
-              <w:t xml:space="preserve">The external/internal separation. Payloads are kept within the trusted boundary; only control/tracking metadata surfaces to the platform.</w:t>
+              <w:t xml:space="preserve">External/internal (cloud/runtime) separation. Payloads stay within the trusted boundary; only control/tracking metadata surfaces to the cloud layer.</w:t>
             </w:r>
           </w:p>
         </w:tc>
@@ -4763,7 +4763,7 @@
                 <w:sz w:val="19"/>
                 <w:szCs w:val="19"/>
               </w:rPr>
-              <w:t xml:space="preserve">Boomi internal runtime</w:t>
+              <w:t xml:space="preserve">Tier 3 — Runtime integration layer (incl. MFT)</w:t>
             </w:r>
           </w:p>
         </w:tc>
@@ -4790,7 +4790,7 @@
                 <w:sz w:val="19"/>
                 <w:szCs w:val="19"/>
               </w:rPr>
-              <w:t xml:space="preserve">Customer-managed runtime in the trusted zone: the generic, config-driven MFT engine, Molecule HA cluster, the MFT Connector, and the config/routing DB.</w:t>
+              <w:t xml:space="preserve">Customer-managed Boomi runtime in the trusted zone: Integration Flow Runtime, internal API gateways (CAM Runtime, Kong), the Boomi MFT Connector, and the generic config-driven MFT engine with its config/routing DB.</w:t>
             </w:r>
           </w:p>
         </w:tc>
@@ -4819,7 +4819,7 @@
                 <w:sz w:val="19"/>
                 <w:szCs w:val="19"/>
               </w:rPr>
-              <w:t xml:space="preserve">Internal hosted estate</w:t>
+              <w:t xml:space="preserve">Tier 4 — Backend / HMRC systems</w:t>
             </w:r>
           </w:p>
         </w:tc>
@@ -4846,7 +4846,7 @@
                 <w:sz w:val="19"/>
                 <w:szCs w:val="19"/>
               </w:rPr>
-              <w:t xml:space="preserve">HoD applications hosted across AWS, Azure, Crown Hosting and Fujitsu, plus WebMethods during coexistence.</w:t>
+              <w:t xml:space="preserve">The Heads-of-Duty (HoD) applications hosted across AWS, Azure, Crown Hosting and Fujitsu, plus WebMethods during coexistence.</w:t>
             </w:r>
           </w:p>
         </w:tc>

</xml_diff>

<commit_message>
Redraw Figure 1 in the clean two-zone source-diagram style: External estate (3rd-party/OGDs, MDTP, SaaS: ETMP/S4H, CRM CF/MSD, Pega, CDS) <-> Boomi iPaaS Platform <-> trust boundary <-> Boomi Internal Runtime <-> HoD apps (AWS/Azure/Crown Hosting/Fujitsu). Boomi-branded rounded platform boxes, orange sub-groups, UML component boxes, blue/purple double-headed arrows. Relabelled Tax->ETMP/S4H per source. Word/HTML intro+caption realigned; draw.io keeps HMRC labels; docs.zip rebuilt.
</commit_message>
<xml_diff>
--- a/assets/boomi-mft-solution-design-document.docx
+++ b/assets/boomi-mft-solution-design-document.docx
@@ -4409,7 +4409,7 @@
           <w:sz w:val="21"/>
           <w:szCs w:val="21"/>
         </w:rPr>
-        <w:t xml:space="preserve">The architecture is presented as four horizontal tiers, top to bottom: consumers, the cloud integration layer, the runtime integration layer, and the backend systems. MFT appears in both integration layers — as cloud components in Tier 2 and as the config-driven engine in Tier 3 — so the file-transfer capability is delivered by the same platform, and governed the same way, as the wider integration and API estate. The diagram below is the logical/deployment view; the editable source (draw.io) accompanies this document.</w:t>
+        <w:t xml:space="preserve">The architecture is shown as a clean logical view. The external estate — 3rd-party consumers/OGDs, the digital tax platform (MDTP) and the native-iPaaS SaaS systems (ETMP/S4H, CRM CF/MSD, Workflow Pega, B&amp;T CDS) — exchanges files with the Boomi iPaaS Platform. Across the external/internal trust boundary, the Boomi internal runtime hosts the config-driven MFT engine and delivers to / collects from the Heads-of-Duty (HoD) applications across AWS, Azure, Crown Hosting and Fujitsu. Section 7.1 details what each layer contains; §7.5 (Figure 2) shows how MFT is driven by the integration platform. The editable source (draw.io) accompanies this document.</w:t>
       </w:r>
     </w:p>
     <w:p>
@@ -4420,7 +4420,7 @@
       <w:r>
         <w:drawing>
           <wp:inline distT="0" distB="0" distL="0" distR="0">
-            <wp:extent cx="5905500" cy="4810125"/>
+            <wp:extent cx="6172200" cy="4552950"/>
             <wp:effectExtent t="0" r="0" b="0" l="0"/>
             <wp:docPr id="1" name="" descr="" title=""/>
             <wp:cNvGraphicFramePr>
@@ -4445,7 +4445,7 @@
                   <pic:spPr bwMode="auto">
                     <a:xfrm>
                       <a:off x="0" y="0"/>
-                      <a:ext cx="5905500" cy="4810125"/>
+                      <a:ext cx="6172200" cy="4552950"/>
                     </a:xfrm>
                     <a:prstGeom prst="rect">
                       <a:avLst/>

</xml_diff>